<commit_message>
docs: correct underfitting claim and unify hyperparameter table
</commit_message>
<xml_diff>
--- a/docs/调参报告.docx
+++ b/docs/调参报告.docx
@@ -210,7 +210,7 @@
           <w:sz w:val="24"/>
           <w:szCs w:val="24"/>
         </w:rPr>
-        <w:t xml:space="preserve">（2.1）随机旋转是“对过拟合模型有用、对欠拟合模型有害”的强正则</w:t>
+        <w:t xml:space="preserve">（2.1）随机旋转是“对有余量的模型有用、对容量紧张的模型有害”的强正则</w:t>
       </w:r>
     </w:p>
     <w:p>
@@ -237,7 +237,7 @@
           <w:sz w:val="24"/>
           <w:szCs w:val="24"/>
         </w:rPr>
-        <w:t xml:space="preserve">CNN | 86.60% | 88.60% | +2.00 | 过拟合型，正则有用</w:t>
+        <w:t xml:space="preserve">CNN | 86.60% | 88.60% | +2.00 | 有余量，正则有用</w:t>
       </w:r>
     </w:p>
     <w:p>
@@ -264,7 +264,7 @@
           <w:sz w:val="24"/>
           <w:szCs w:val="24"/>
         </w:rPr>
-        <w:t xml:space="preserve">RNN | 72.40% | 69.20%（本轮搜索配置） | −3.20 | 欠拟合型，任务变难反而更差</w:t>
+        <w:t xml:space="preserve">RNN | 72.40% | 69.20%（本轮搜索配置） | −3.20 | 容量紧张，任务变难反而更差</w:t>
       </w:r>
     </w:p>
     <w:p>
@@ -282,7 +282,25 @@
           <w:sz w:val="24"/>
           <w:szCs w:val="24"/>
         </w:rPr>
-        <w:t xml:space="preserve">这个分化与之前的数据充足度分析完全一致：CNN、CNN_attention 是过拟合型（train_acc 远高于 val_acc），旋转相当于“加数据”，有用；RNN、ViT 是欠拟合型（train_acc 低于 val_acc），旋转让任务更难，无益甚至有害。</w:t>
+        <w:t xml:space="preserve">为什么符号会相反？关键是这个模型还有没有“余量”。CNN 在第 86 轮存档时 train_acc 91.60% / val_acc 90.00%，全程挂着 1.6 pt 的过拟合间隙——它有能力记住训练集，旋转相当于“加数据”，把记忆通道堵了一部分，泛化反而变好。RNN 则是 0.53 M 参数的窄模型（单层双向 LSTM），旋转把任务变难之后它吸收不了，容错空间被吃掉。</w:t>
+      </w:r>
+    </w:p>
+    <w:p>
+      <w:r>
+        <w:rPr>
+          <w:sz w:val="24"/>
+          <w:szCs w:val="24"/>
+        </w:rPr>
+        <w:t xml:space="preserve">这里必须提醒一个口径问题：train_acc 是在带数据增强（翻转 / 旋转 / 裁剪）的图上算的，val_acc 不带增强。所以“train_acc 低于 val_acc”本身并不等于欠拟合，不适合单独拿它当判据。更可靠的说法是按曲线的分叉方向判断：CNN 是全程轻微过拟合（间隙稳定在 1.6 pt）；ViT 是后段才过拟合（前 37 轮 train_acc 一直低于 val_acc，第 38 轮之后才反向分叉，到第 47 轮被早停时已拉开 10.1 pt）；RNN 则始终没有出现明显过拟合。</w:t>
+      </w:r>
+    </w:p>
+    <w:p>
+      <w:r>
+        <w:rPr>
+          <w:sz w:val="24"/>
+          <w:szCs w:val="24"/>
+        </w:rPr>
+        <w:t xml:space="preserve">因此旋转策略不应该按“过拟合 / 欠拟合”两个标签去分，而应该按“加大难度后这个模型还吃不消”来看：CNN 吃得消，RNN 吃不消。</w:t>
       </w:r>
     </w:p>
     <w:p>
@@ -845,6 +863,15 @@
           <w:sz w:val="24"/>
           <w:szCs w:val="24"/>
         </w:rPr>
+        <w:t xml:space="preserve">原始图片（计数与归一化两栏）在 outputs/eval3/&lt;model&gt;_acc/confusion_matrix.png；五个模型拼图在 docs/confusion_matrices.png，也已内嵌到 docs/models_architecture.html 的「混淆矩阵」一节。</w:t>
+      </w:r>
+    </w:p>
+    <w:p>
+      <w:r>
+        <w:rPr>
+          <w:sz w:val="24"/>
+          <w:szCs w:val="24"/>
+        </w:rPr>
       </w:r>
     </w:p>
     <w:p>
@@ -979,7 +1006,7 @@
           <w:sz w:val="24"/>
           <w:szCs w:val="24"/>
         </w:rPr>
-        <w:t xml:space="preserve">· RNN/ViT 处于欠拟合，缺的是归纳偏置与配方，不是数据量。</w:t>
+        <w:t xml:space="preserve">· RNN/ViT 与头部模型的差距主要来自归纳偏置与训练配方，不是数据量。</w:t>
       </w:r>
     </w:p>
     <w:p>
@@ -1050,16 +1077,16 @@
           <w:sz w:val="24"/>
           <w:szCs w:val="24"/>
         </w:rPr>
-        <w:t xml:space="preserve">结论：净差异 +0.20 pt，远小于 ±1.4 pt 的运行噪声，因此在 1985 张这个数据规模上观察不到注意力的收益。而且它换来的不是全面提升，而是召回上的重分配（cat 涨 11.2 pt，dog 跌 10.8 pt）。</w:t>
-      </w:r>
-    </w:p>
-    <w:p>
-      <w:r>
-        <w:rPr>
-          <w:sz w:val="24"/>
-          <w:szCs w:val="24"/>
-        </w:rPr>
-        <w:t xml:space="preserve">为什么？因为注意力头里的 Σ αᵢ·(Xᵢ·W_V) = (Σ αᵢ·Xᵢ)·W_V —— W_V 是线性的、α 是凸组合，所以这个头等价于“内容加权平均池化 + 一个线性层”，而 CNN 的头就是“平均池化 + 一个线性层”。W_V 会被后面的 FNN 首层完全吸收，真正新增的只有 α 这一组权重。之前做的消融也印证了这点：把注意力换成 masked 平均池化只掉 1.2 pt。</w:t>
+        <w:t xml:space="preserve">结论：净差异 +0.20 pt，远小于 ±1.4 pt 的运行噪声，因此在 1985 张这个数据规模上观察不到注意力的净收益。而且它换来的不是全面提升，而是召回上的重分配（cat 涨 11.2 pt，dog 跌 10.8 pt）。</w:t>
+      </w:r>
+    </w:p>
+    <w:p>
+      <w:r>
+        <w:rPr>
+          <w:sz w:val="24"/>
+          <w:szCs w:val="24"/>
+        </w:rPr>
+        <w:t xml:space="preserve">为什么？因为注意力头里的 Σ αᵢ·(Xᵢ·W_V) = (Σ αᵢ·Xᵢ)·W_V —— W_V 是线性的、α 是凸组合，所以这个头等价于“内容加权平均池化 + 一个线性层”，而 CNN 的头就是“平均池化 + 一个线性层”。W_V 会被后面的 FNN 首层完全吸收，真正新增的只有 α 这一组权重。</w:t>
       </w:r>
     </w:p>
     <w:p>
@@ -1077,6 +1104,15 @@
           <w:sz w:val="24"/>
           <w:szCs w:val="24"/>
         </w:rPr>
+        <w:t xml:space="preserve">关于这条结论的证据强度，需要说清楚：支撑它的是（a）两个模型在主干同构、各自调满超参后的最终成绩对比，以及（b）在存档权重上把 α 替换成均匀权重所看到的分数下降。但（b）属于推理期替换、分类头没有重训，只能说明“这个头对学到的权重是敏感的”，不能读成“注意力值多少分”——换成均匀权重后掉 10.6 pt，其中很大一块是分布不匹配的惩罚。真正的训练期消融（换成平均池化头、从头训到收敛）本轮没有完成，所以本条应表述为推断而非实测消融。</w:t>
+      </w:r>
+    </w:p>
+    <w:p>
+      <w:r>
+        <w:rPr>
+          <w:sz w:val="24"/>
+          <w:szCs w:val="24"/>
+        </w:rPr>
       </w:r>
     </w:p>
     <w:p>
@@ -1157,6 +1193,15 @@
           <w:sz w:val="24"/>
           <w:szCs w:val="24"/>
         </w:rPr>
+        <w:t xml:space="preserve">· 五个最优权重已通过 Git LFS 入库（仓库体积因此增加约 313 MB），.gitattributes 里写 *.ckpt filter=lfs；克隆前需 git lfs install。</w:t>
+      </w:r>
+    </w:p>
+    <w:p>
+      <w:r>
+        <w:rPr>
+          <w:sz w:val="24"/>
+          <w:szCs w:val="24"/>
+        </w:rPr>
       </w:r>
     </w:p>
     <w:p>
@@ -1183,7 +1228,7 @@
           <w:sz w:val="24"/>
           <w:szCs w:val="24"/>
         </w:rPr>
-        <w:t xml:space="preserve">2. RNN 不要加旋转（−2.4 pt）。如果想让各模型独立选择增强，给 RNN/ViT 各自的 cfg 换一套不含 RandomRotate 的 data 管线即可（一行改动）。</w:t>
+        <w:t xml:space="preserve">2. RNN 不要加旋转（−2.4 pt）。如果想让各模型独立选择增强，给 RNN 各自的 cfg 换一套不含 RandomRotate 的 data 管线即可（一行改动）。</w:t>
       </w:r>
     </w:p>
     <w:p>
@@ -1228,6 +1273,15 @@
           <w:sz w:val="24"/>
           <w:szCs w:val="24"/>
         </w:rPr>
+        <w:t xml:space="preserve">7. 若要让“注意力净收益”从推断变成结论，需要补一个训练期消融：同一主干、同一配方，头部换成 masked 平均池化，训练到早停（预计 40 分钟）。</w:t>
+      </w:r>
+    </w:p>
+    <w:p>
+      <w:r>
+        <w:rPr>
+          <w:sz w:val="24"/>
+          <w:szCs w:val="24"/>
+        </w:rPr>
       </w:r>
     </w:p>
     <w:p>
@@ -1352,34 +1406,43 @@
           <w:sz w:val="24"/>
           <w:szCs w:val="24"/>
         </w:rPr>
-        <w:t xml:space="preserve">· 权重（唯一保留的版本，按 val_acc 存档）：outputs/final3/{cnn,dnn,vit,rnn,cnn_attention}_acc/</w:t>
-      </w:r>
-    </w:p>
-    <w:p>
-      <w:r>
-        <w:rPr>
-          <w:sz w:val="24"/>
-          <w:szCs w:val="24"/>
-        </w:rPr>
-        <w:t xml:space="preserve">· 评估：outputs/eval3/{cnn,dnn,vit,rnn,cnn_attention}_acc/（混淆矩阵 PNG/TXT、metrics.json、predictions.csv）</w:t>
-      </w:r>
-    </w:p>
-    <w:p>
-      <w:r>
-        <w:rPr>
-          <w:sz w:val="24"/>
-          <w:szCs w:val="24"/>
-        </w:rPr>
-        <w:t xml:space="preserve">· 搜索原始记录：outputs/tuning/*_rot_search_trials.jsonl 与 *_best.json</w:t>
-      </w:r>
-    </w:p>
-    <w:p>
-      <w:r>
-        <w:rPr>
-          <w:sz w:val="24"/>
-          <w:szCs w:val="24"/>
-        </w:rPr>
-        <w:t xml:space="preserve">· 汇总表：outputs/all_metrics.md</w:t>
+        <w:t xml:space="preserve">· 权重（已通过 Git LFS 入库）：outputs/final3/{cnn,dnn,vit,rnn,cnn_attention}_acc/</w:t>
+      </w:r>
+    </w:p>
+    <w:p>
+      <w:r>
+        <w:rPr>
+          <w:sz w:val="24"/>
+          <w:szCs w:val="24"/>
+        </w:rPr>
+        <w:t xml:space="preserve">· 评估：outputs/eval3/{cnn,dnn,vit,rnn,cnn_attention}_acc/（混淆矩阵 PNG/TXT、metrics.json、predictions.csv，未入库）</w:t>
+      </w:r>
+    </w:p>
+    <w:p>
+      <w:r>
+        <w:rPr>
+          <w:sz w:val="24"/>
+          <w:szCs w:val="24"/>
+        </w:rPr>
+        <w:t xml:space="preserve">· 搜索原始记录：outputs/tuning/*_rot_search_trials.jsonl（未入库）</w:t>
+      </w:r>
+    </w:p>
+    <w:p>
+      <w:r>
+        <w:rPr>
+          <w:sz w:val="24"/>
+          <w:szCs w:val="24"/>
+        </w:rPr>
+        <w:t xml:space="preserve">· 汇总表：outputs/all_metrics.md（未入库）</w:t>
+      </w:r>
+    </w:p>
+    <w:p>
+      <w:r>
+        <w:rPr>
+          <w:sz w:val="24"/>
+          <w:szCs w:val="24"/>
+        </w:rPr>
+        <w:t xml:space="preserve">· 超参数表：docs/超参数表.md</w:t>
       </w:r>
     </w:p>
     <w:p>

</xml_diff>